<commit_message>
Update Defamation by German Grebentsov.docx
</commit_message>
<xml_diff>
--- a/Defamation/Defamation by German Grebentsov.docx
+++ b/Defamation/Defamation by German Grebentsov.docx
@@ -257,15 +257,7 @@
           <w:szCs w:val="24"/>
           <w:lang w:val="en-US"/>
         </w:rPr>
-        <w:t>Grebentsov</w:t>
-      </w:r>
-      <w:r>
-        <w:rPr>
-          <w:sz w:val="24"/>
-          <w:szCs w:val="24"/>
-          <w:lang w:val="en-US"/>
-        </w:rPr>
-        <w:t xml:space="preserve"> </w:t>
+        <w:t xml:space="preserve">Grebentsov </w:t>
       </w:r>
       <w:r>
         <w:rPr>
@@ -565,39 +557,7 @@
           <w:szCs w:val="24"/>
           <w:lang w:val="en-US"/>
         </w:rPr>
-        <w:t xml:space="preserve">. Sometime in early 2021, German was assigned to fill her position, effectively becoming my manager. It is important to note that since Edna left, I have not been given any assignments in the Flight Control Software department by either </w:t>
-      </w:r>
-      <w:r>
-        <w:rPr>
-          <w:sz w:val="24"/>
-          <w:szCs w:val="24"/>
-          <w:lang w:val="en-US"/>
-        </w:rPr>
-        <w:t xml:space="preserve">Amnon Dar </w:t>
-      </w:r>
-      <w:r>
-        <w:rPr>
-          <w:sz w:val="24"/>
-          <w:szCs w:val="24"/>
-          <w:lang w:val="en-US"/>
-        </w:rPr>
-        <w:t xml:space="preserve">or </w:t>
-      </w:r>
-      <w:r>
-        <w:rPr>
-          <w:sz w:val="24"/>
-          <w:szCs w:val="24"/>
-          <w:lang w:val="en-US"/>
-        </w:rPr>
-        <w:t>German Grebentsov</w:t>
-      </w:r>
-      <w:r>
-        <w:rPr>
-          <w:sz w:val="24"/>
-          <w:szCs w:val="24"/>
-          <w:lang w:val="en-US"/>
-        </w:rPr>
-        <w:t xml:space="preserve">. Once Enda had left, they shut my budget down and refused to give me any assignments at all. </w:t>
+        <w:t xml:space="preserve">. Sometime in early 2021, German was assigned to fill her position, effectively becoming my manager. It is important to note that since Edna left, I have not been given any assignments in the Flight Control Software department by either Amnon Dar or German Grebentsov. Once Enda had left, they shut my budget down and refused to give me any assignments at all. </w:t>
       </w:r>
     </w:p>
     <w:p>
@@ -727,15 +687,7 @@
           <w:szCs w:val="24"/>
           <w:lang w:val="en-US"/>
         </w:rPr>
-        <w:t xml:space="preserve"> </w:t>
-      </w:r>
-      <w:r>
-        <w:rPr>
-          <w:sz w:val="24"/>
-          <w:szCs w:val="24"/>
-          <w:lang w:val="en-US"/>
-        </w:rPr>
-        <w:t>(052-618-0237)</w:t>
+        <w:t xml:space="preserve"> (052-618-0237)</w:t>
       </w:r>
       <w:r>
         <w:rPr>
@@ -751,15 +703,7 @@
           <w:szCs w:val="24"/>
           <w:lang w:val="en-US"/>
         </w:rPr>
-        <w:t xml:space="preserve"> </w:t>
-      </w:r>
-      <w:r>
-        <w:rPr>
-          <w:sz w:val="24"/>
-          <w:szCs w:val="24"/>
-          <w:lang w:val="en-US"/>
-        </w:rPr>
-        <w:t>(052-618-0090)</w:t>
+        <w:t xml:space="preserve"> (052-618-0090)</w:t>
       </w:r>
       <w:r>
         <w:rPr>
@@ -783,23 +727,7 @@
           <w:szCs w:val="24"/>
           <w:lang w:val="en-US"/>
         </w:rPr>
-        <w:t xml:space="preserve">. Neither </w:t>
-      </w:r>
-      <w:r>
-        <w:rPr>
-          <w:sz w:val="24"/>
-          <w:szCs w:val="24"/>
-          <w:lang w:val="en-US"/>
-        </w:rPr>
-        <w:t xml:space="preserve">Yaniv </w:t>
-      </w:r>
-      <w:r>
-        <w:rPr>
-          <w:sz w:val="24"/>
-          <w:szCs w:val="24"/>
-          <w:lang w:val="en-US"/>
-        </w:rPr>
-        <w:t>nor Igor had anything to do with the ILM project</w:t>
+        <w:t>. Neither Yaniv nor Igor had anything to do with the ILM project</w:t>
       </w:r>
       <w:r>
         <w:rPr>
@@ -1138,15 +1066,31 @@
           <w:szCs w:val="24"/>
           <w:lang w:val="en-US"/>
         </w:rPr>
-        <w:t xml:space="preserve">From January until the end of June 2022, I worked on the World Perception project. </w:t>
-      </w:r>
-      <w:r>
-        <w:rPr>
-          <w:sz w:val="24"/>
-          <w:szCs w:val="24"/>
-          <w:lang w:val="en-US"/>
-        </w:rPr>
-        <w:t xml:space="preserve">I received funding and technical direction from </w:t>
+        <w:t xml:space="preserve">From January until the end of June 2022, I worked on the World Perception project. I received funding and technical direction from Saimon Shlevich. </w:t>
+      </w:r>
+      <w:r>
+        <w:rPr>
+          <w:sz w:val="24"/>
+          <w:szCs w:val="24"/>
+          <w:lang w:val="en-US"/>
+        </w:rPr>
+        <w:t xml:space="preserve">German </w:t>
+      </w:r>
+      <w:r>
+        <w:rPr>
+          <w:sz w:val="24"/>
+          <w:szCs w:val="24"/>
+          <w:lang w:val="en-US"/>
+        </w:rPr>
+        <w:t>remained</w:t>
+      </w:r>
+      <w:r>
+        <w:rPr>
+          <w:sz w:val="24"/>
+          <w:szCs w:val="24"/>
+          <w:lang w:val="en-US"/>
+        </w:rPr>
+        <w:t xml:space="preserve"> my formal manager (on paper). German’s involvement was limited to allowing me to work for </w:t>
       </w:r>
       <w:r>
         <w:rPr>
@@ -1162,46 +1106,6 @@
           <w:szCs w:val="24"/>
           <w:lang w:val="en-US"/>
         </w:rPr>
-        <w:t xml:space="preserve"> Shlevich. </w:t>
-      </w:r>
-      <w:r>
-        <w:rPr>
-          <w:sz w:val="24"/>
-          <w:szCs w:val="24"/>
-          <w:lang w:val="en-US"/>
-        </w:rPr>
-        <w:t xml:space="preserve">German </w:t>
-      </w:r>
-      <w:r>
-        <w:rPr>
-          <w:sz w:val="24"/>
-          <w:szCs w:val="24"/>
-          <w:lang w:val="en-US"/>
-        </w:rPr>
-        <w:t>remained</w:t>
-      </w:r>
-      <w:r>
-        <w:rPr>
-          <w:sz w:val="24"/>
-          <w:szCs w:val="24"/>
-          <w:lang w:val="en-US"/>
-        </w:rPr>
-        <w:t xml:space="preserve"> my formal manager (on paper). German’s involvement was limited to allowing me to work for </w:t>
-      </w:r>
-      <w:r>
-        <w:rPr>
-          <w:sz w:val="24"/>
-          <w:szCs w:val="24"/>
-          <w:lang w:val="en-US"/>
-        </w:rPr>
-        <w:t>Saimon</w:t>
-      </w:r>
-      <w:r>
-        <w:rPr>
-          <w:sz w:val="24"/>
-          <w:szCs w:val="24"/>
-          <w:lang w:val="en-US"/>
-        </w:rPr>
         <w:t xml:space="preserve"> Shlevich in Robotics. I worked from my office in </w:t>
       </w:r>
       <w:r>
@@ -1283,15 +1187,7 @@
           <w:szCs w:val="24"/>
           <w:lang w:val="en-US"/>
         </w:rPr>
-        <w:t xml:space="preserve"> </w:t>
-      </w:r>
-      <w:r>
-        <w:rPr>
-          <w:sz w:val="24"/>
-          <w:szCs w:val="24"/>
-          <w:lang w:val="en-US"/>
-        </w:rPr>
-        <w:t>city</w:t>
+        <w:t xml:space="preserve"> city</w:t>
       </w:r>
       <w:r>
         <w:rPr>
@@ -1388,7 +1284,23 @@
           <w:szCs w:val="24"/>
           <w:lang w:val="en-US"/>
         </w:rPr>
-        <w:t>Margarita Osmak.</w:t>
+        <w:t>Margarita Osmak</w:t>
+      </w:r>
+      <w:r>
+        <w:rPr>
+          <w:sz w:val="24"/>
+          <w:szCs w:val="24"/>
+          <w:lang w:val="en-US"/>
+        </w:rPr>
+        <w:t xml:space="preserve"> (054-477-2539)</w:t>
+      </w:r>
+      <w:r>
+        <w:rPr>
+          <w:sz w:val="24"/>
+          <w:szCs w:val="24"/>
+          <w:lang w:val="en-US"/>
+        </w:rPr>
+        <w:t>.</w:t>
       </w:r>
       <w:r>
         <w:rPr>
@@ -1436,6 +1348,14 @@
           <w:szCs w:val="24"/>
           <w:lang w:val="en-US"/>
         </w:rPr>
+        <w:t xml:space="preserve"> ()</w:t>
+      </w:r>
+      <w:r>
+        <w:rPr>
+          <w:sz w:val="24"/>
+          <w:szCs w:val="24"/>
+          <w:lang w:val="en-US"/>
+        </w:rPr>
         <w:t xml:space="preserve">, and </w:t>
       </w:r>
       <w:r>
@@ -1597,31 +1517,7 @@
           <w:szCs w:val="24"/>
           <w:lang w:val="en-US"/>
         </w:rPr>
-        <w:t xml:space="preserve">had prevented her from hiring me but would not explain why. </w:t>
-      </w:r>
-      <w:r>
-        <w:rPr>
-          <w:sz w:val="24"/>
-          <w:szCs w:val="24"/>
-          <w:lang w:val="en-US"/>
-        </w:rPr>
-        <w:t xml:space="preserve">I recorded our phone conversation with </w:t>
-      </w:r>
-      <w:r>
-        <w:rPr>
-          <w:sz w:val="24"/>
-          <w:szCs w:val="24"/>
-          <w:lang w:val="en-US"/>
-        </w:rPr>
-        <w:t>her</w:t>
-      </w:r>
-      <w:r>
-        <w:rPr>
-          <w:sz w:val="24"/>
-          <w:szCs w:val="24"/>
-          <w:lang w:val="en-US"/>
-        </w:rPr>
-        <w:t>.</w:t>
+        <w:t>had prevented her from hiring me but would not explain why. I recorded our phone conversation with her.</w:t>
       </w:r>
       <w:r>
         <w:rPr>
@@ -3061,7 +2957,39 @@
           <w:szCs w:val="24"/>
           <w:lang w:val="en-US"/>
         </w:rPr>
-        <w:t xml:space="preserve">I found a suitable position in Dmitry Sokolovskiy's department at the Elta Systems factory in Ashdod, working on Leonid Magid's team. Dmitry Sokolovskiy is an old acquaintance. We have known each other for 36 years. Leonid Magid is also an old acquaintance. We have known each other for 15 years and even worked together a couple of years ago, when he came to Malat to do some work on behalf of Elta. Both of them made efforts to bring me into their department, but their human resources department blocked it due to German’s intervention. </w:t>
+        <w:t xml:space="preserve">I found a suitable position in Dmitry Sokolovskiy's department at the Elta Systems factory in Ashdod, working on Leonid Magid's team. Dmitry Sokolovskiy </w:t>
+      </w:r>
+      <w:r>
+        <w:rPr>
+          <w:sz w:val="24"/>
+          <w:szCs w:val="24"/>
+          <w:lang w:val="en-US"/>
+        </w:rPr>
+        <w:t xml:space="preserve">(050-763-4975) </w:t>
+      </w:r>
+      <w:r>
+        <w:rPr>
+          <w:sz w:val="24"/>
+          <w:szCs w:val="24"/>
+          <w:lang w:val="en-US"/>
+        </w:rPr>
+        <w:t xml:space="preserve">is an old acquaintance. We have known each other for 36 years. Leonid Magid </w:t>
+      </w:r>
+      <w:r>
+        <w:rPr>
+          <w:sz w:val="24"/>
+          <w:szCs w:val="24"/>
+          <w:lang w:val="en-US"/>
+        </w:rPr>
+        <w:t xml:space="preserve">(054-993-2960) </w:t>
+      </w:r>
+      <w:r>
+        <w:rPr>
+          <w:sz w:val="24"/>
+          <w:szCs w:val="24"/>
+          <w:lang w:val="en-US"/>
+        </w:rPr>
+        <w:t xml:space="preserve">is also an old acquaintance. We have known each other for 15 years and even worked together a couple of years ago, when he came to Malat to do some work on behalf of Elta. Both of them made efforts to bring me into their department, but their human resources department blocked it due to German’s intervention. </w:t>
       </w:r>
     </w:p>
     <w:p>

</xml_diff>